<commit_message>
cambios en la tabla Proyectos de la BD
se agregaron datos para identificar el periodo en el que se dieron los proyectos
</commit_message>
<xml_diff>
--- a/Modelo Base de datos/Modelo base de datos.docx
+++ b/Modelo Base de datos/Modelo base de datos.docx
@@ -1765,6 +1765,28 @@
         <w:rPr>
           <w:rtl w:val="0"/>
         </w:rPr>
+        <w:t xml:space="preserve">    column(anio_inicio) : INT &lt;&lt;NOT NULL&gt;&gt;</w:t>
+      </w:r>
+    </w:p>
+    <w:p>
+      <w:pPr>
+        <w:rPr/>
+      </w:pPr>
+      <w:r>
+        <w:rPr>
+          <w:rtl w:val="0"/>
+        </w:rPr>
+        <w:t xml:space="preserve">    column(anio_fin) : INT &lt;&lt;NOT NULL&gt;&gt;</w:t>
+      </w:r>
+    </w:p>
+    <w:p>
+      <w:pPr>
+        <w:rPr/>
+      </w:pPr>
+      <w:r>
+        <w:rPr>
+          <w:rtl w:val="0"/>
+        </w:rPr>
         <w:t xml:space="preserve">  }</w:t>
       </w:r>
     </w:p>
@@ -2263,17 +2285,6 @@
         <w:rPr>
           <w:rtl w:val="0"/>
         </w:rPr>
-        <w:t xml:space="preserve">' Nota: Flechas extendidas (----) para empujar el bloque lejos del centro</w:t>
-      </w:r>
-    </w:p>
-    <w:p>
-      <w:pPr>
-        <w:rPr/>
-      </w:pPr>
-      <w:r>
-        <w:rPr>
-          <w:rtl w:val="0"/>
-        </w:rPr>
         <w:t xml:space="preserve">integrante "1" -right---- "0..1" usuario_gestor : "Es"</w:t>
       </w:r>
     </w:p>
@@ -2371,17 +2382,6 @@
         <w:rPr>
           <w:rtl w:val="0"/>
         </w:rPr>
-        <w:t xml:space="preserve">' Nota: Flechas extendidas (----) para dar espacio al texto y la línea</w:t>
-      </w:r>
-    </w:p>
-    <w:p>
-      <w:pPr>
-        <w:rPr/>
-      </w:pPr>
-      <w:r>
-        <w:rPr>
-          <w:rtl w:val="0"/>
-        </w:rPr>
         <w:t xml:space="preserve">integrante "1" -left---- "0..*" proyecto_integrantes : "  Participa en  "</w:t>
       </w:r>
     </w:p>
@@ -2532,6 +2532,16 @@
           <w:rtl w:val="0"/>
         </w:rPr>
         <w:t xml:space="preserve">@enduml</w:t>
+      </w:r>
+    </w:p>
+    <w:p>
+      <w:pPr>
+        <w:rPr/>
+      </w:pPr>
+      <w:r>
+        <w:rPr>
+          <w:rtl w:val="0"/>
+        </w:rPr>
       </w:r>
     </w:p>
     <w:p>
@@ -2702,6 +2712,20 @@
       <w:sz w:val="52"/>
       <w:szCs w:val="52"/>
     </w:rPr>
+  </w:style>
+  <w:style w:type="table" w:styleId="TableNormal" w:default="1">
+    <w:name w:val="TableNormal"/>
+    <w:tblPr>
+      <w:tblCellMar>
+        <w:top w:w="100.0" w:type="dxa"/>
+        <w:left w:w="100.0" w:type="dxa"/>
+        <w:bottom w:w="100.0" w:type="dxa"/>
+        <w:right w:w="100.0" w:type="dxa"/>
+      </w:tblCellMar>
+    </w:tblPr>
+  </w:style>
+  <w:style w:type="paragraph" w:styleId="Normal" w:default="1">
+    <w:name w:val="normal"/>
   </w:style>
   <w:style w:type="paragraph" w:styleId="Subtitle">
     <w:name w:val="Subtitle"/>
@@ -3043,4 +3067,19 @@
   </a:objectDefaults>
   <a:extraClrSchemeLst/>
 </a:theme>
+</file>
+
+<file path=customXML/item1.xml><?xml version="1.0" encoding="utf-8"?>
+<go:gDocsCustomXmlDataStorage xmlns:go="http://customooxmlschemas.google.com/" xmlns:r="http://schemas.openxmlformats.org/officeDocument/2006/relationships" uri="GoogleDocsCustomDataVersion2">
+  <go:docsCustomData xmlns:go="http://customooxmlschemas.google.com/" roundtripDataSignature="AMtx7mhfLYubquy7h07Xluhi530HIFd8dQ==">CgMxLjA4AHIhMXBnakNTRGdiRTEzUGdVakFEZmk4UlBZUXFYWUFTNUtM</go:docsCustomData>
+</go:gDocsCustomXmlDataStorage>
+</file>
+
+<file path=customXML/itemProps1.xml><?xml version="1.0" encoding="utf-8"?>
+<ds:datastoreItem xmlns:ds="http://schemas.openxmlformats.org/officeDocument/2006/customXml" ds:itemID="{11111111-1234-1234-1234-123412341234}">
+  <ds:schemaRefs>
+    <ds:schemaRef ds:uri="http://schemas.openxmlformats.org/officeDocument/2006/relationships"/>
+    <ds:schemaRef ds:uri="http://customooxmlschemas.google.com/"/>
+  </ds:schemaRefs>
+</ds:datastoreItem>
 </file>
</xml_diff>

<commit_message>
panel de ABM de reconocimientos
se agrego el panel de reconocimientos para agregar modificar y dar de baja reconocimientos remplazando el sistema json
</commit_message>
<xml_diff>
--- a/Modelo Base de datos/Modelo base de datos.docx
+++ b/Modelo Base de datos/Modelo base de datos.docx
@@ -230,16 +230,6 @@
         <w:rPr>
           <w:rtl w:val="0"/>
         </w:rPr>
-      </w:r>
-    </w:p>
-    <w:p>
-      <w:pPr>
-        <w:rPr/>
-      </w:pPr>
-      <w:r>
-        <w:rPr>
-          <w:rtl w:val="0"/>
-        </w:rPr>
         <w:t xml:space="preserve">!define primary_key(x) &lt;b&gt;[PK] x&lt;/b&gt;</w:t>
       </w:r>
     </w:p>
@@ -284,16 +274,6 @@
         <w:rPr>
           <w:rtl w:val="0"/>
         </w:rPr>
-      </w:r>
-    </w:p>
-    <w:p>
-      <w:pPr>
-        <w:rPr/>
-      </w:pPr>
-      <w:r>
-        <w:rPr>
-          <w:rtl w:val="0"/>
-        </w:rPr>
         <w:t xml:space="preserve">title Modelo de Base de Datos</w:t>
       </w:r>
     </w:p>
@@ -305,16 +285,6 @@
         <w:rPr>
           <w:rtl w:val="0"/>
         </w:rPr>
-      </w:r>
-    </w:p>
-    <w:p>
-      <w:pPr>
-        <w:rPr/>
-      </w:pPr>
-      <w:r>
-        <w:rPr>
-          <w:rtl w:val="0"/>
-        </w:rPr>
         <w:t xml:space="preserve">' ==========================================</w:t>
       </w:r>
     </w:p>
@@ -348,16 +318,6 @@
         <w:rPr>
           <w:rtl w:val="0"/>
         </w:rPr>
-      </w:r>
-    </w:p>
-    <w:p>
-      <w:pPr>
-        <w:rPr/>
-      </w:pPr>
-      <w:r>
-        <w:rPr>
-          <w:rtl w:val="0"/>
-        </w:rPr>
         <w:t xml:space="preserve">package "Núcleo y Roles" {</w:t>
       </w:r>
     </w:p>
@@ -424,16 +384,6 @@
         <w:rPr>
           <w:rtl w:val="0"/>
         </w:rPr>
-      </w:r>
-    </w:p>
-    <w:p>
-      <w:pPr>
-        <w:rPr/>
-      </w:pPr>
-      <w:r>
-        <w:rPr>
-          <w:rtl w:val="0"/>
-        </w:rPr>
         <w:t xml:space="preserve">  table(integrante) {</w:t>
       </w:r>
     </w:p>
@@ -621,16 +571,6 @@
         <w:rPr>
           <w:rtl w:val="0"/>
         </w:rPr>
-      </w:r>
-    </w:p>
-    <w:p>
-      <w:pPr>
-        <w:rPr/>
-      </w:pPr>
-      <w:r>
-        <w:rPr>
-          <w:rtl w:val="0"/>
-        </w:rPr>
         <w:t xml:space="preserve">package "Gestión e Infraestructura" {</w:t>
       </w:r>
     </w:p>
@@ -763,16 +703,6 @@
         <w:rPr>
           <w:rtl w:val="0"/>
         </w:rPr>
-      </w:r>
-    </w:p>
-    <w:p>
-      <w:pPr>
-        <w:rPr/>
-      </w:pPr>
-      <w:r>
-        <w:rPr>
-          <w:rtl w:val="0"/>
-        </w:rPr>
         <w:t xml:space="preserve">  table(configuracion_sitio) {</w:t>
       </w:r>
     </w:p>
@@ -861,16 +791,6 @@
         <w:rPr>
           <w:rtl w:val="0"/>
         </w:rPr>
-      </w:r>
-    </w:p>
-    <w:p>
-      <w:pPr>
-        <w:rPr/>
-      </w:pPr>
-      <w:r>
-        <w:rPr>
-          <w:rtl w:val="0"/>
-        </w:rPr>
         <w:t xml:space="preserve">  table(colaboradores) {</w:t>
       </w:r>
     </w:p>
@@ -959,16 +879,6 @@
         <w:rPr>
           <w:rtl w:val="0"/>
         </w:rPr>
-      </w:r>
-    </w:p>
-    <w:p>
-      <w:pPr>
-        <w:rPr/>
-      </w:pPr>
-      <w:r>
-        <w:rPr>
-          <w:rtl w:val="0"/>
-        </w:rPr>
         <w:t xml:space="preserve">package "Producción Académica" {</w:t>
       </w:r>
     </w:p>
@@ -1178,16 +1088,6 @@
         <w:rPr>
           <w:rtl w:val="0"/>
         </w:rPr>
-      </w:r>
-    </w:p>
-    <w:p>
-      <w:pPr>
-        <w:rPr/>
-      </w:pPr>
-      <w:r>
-        <w:rPr>
-          <w:rtl w:val="0"/>
-        </w:rPr>
         <w:t xml:space="preserve">  table(integrantes_tesis) {</w:t>
       </w:r>
     </w:p>
@@ -1265,16 +1165,6 @@
         <w:rPr>
           <w:rtl w:val="0"/>
         </w:rPr>
-      </w:r>
-    </w:p>
-    <w:p>
-      <w:pPr>
-        <w:rPr/>
-      </w:pPr>
-      <w:r>
-        <w:rPr>
-          <w:rtl w:val="0"/>
-        </w:rPr>
         <w:t xml:space="preserve">package "Institucional (LACIS)" {</w:t>
       </w:r>
     </w:p>
@@ -1363,16 +1253,6 @@
         <w:rPr>
           <w:rtl w:val="0"/>
         </w:rPr>
-      </w:r>
-    </w:p>
-    <w:p>
-      <w:pPr>
-        <w:rPr/>
-      </w:pPr>
-      <w:r>
-        <w:rPr>
-          <w:rtl w:val="0"/>
-        </w:rPr>
         <w:t xml:space="preserve">  table(integrantes_lacis) {</w:t>
       </w:r>
     </w:p>
@@ -1450,16 +1330,6 @@
         <w:rPr>
           <w:rtl w:val="0"/>
         </w:rPr>
-      </w:r>
-    </w:p>
-    <w:p>
-      <w:pPr>
-        <w:rPr/>
-      </w:pPr>
-      <w:r>
-        <w:rPr>
-          <w:rtl w:val="0"/>
-        </w:rPr>
         <w:t xml:space="preserve">package "Proyectos y Desarrollos" {</w:t>
       </w:r>
     </w:p>
@@ -1526,6 +1396,17 @@
         <w:rPr>
           <w:rtl w:val="0"/>
         </w:rPr>
+        <w:t xml:space="preserve">    column(activo) : BOOLEAN &lt;&lt;Baja lógica&gt;&gt;</w:t>
+      </w:r>
+    </w:p>
+    <w:p>
+      <w:pPr>
+        <w:rPr/>
+      </w:pPr>
+      <w:r>
+        <w:rPr>
+          <w:rtl w:val="0"/>
+        </w:rPr>
         <w:t xml:space="preserve">  }</w:t>
       </w:r>
     </w:p>
@@ -1537,16 +1418,6 @@
         <w:rPr>
           <w:rtl w:val="0"/>
         </w:rPr>
-      </w:r>
-    </w:p>
-    <w:p>
-      <w:pPr>
-        <w:rPr/>
-      </w:pPr>
-      <w:r>
-        <w:rPr>
-          <w:rtl w:val="0"/>
-        </w:rPr>
         <w:t xml:space="preserve">  table(proyecto_reconocimientos) {</w:t>
       </w:r>
     </w:p>
@@ -1613,16 +1484,6 @@
         <w:rPr>
           <w:rtl w:val="0"/>
         </w:rPr>
-      </w:r>
-    </w:p>
-    <w:p>
-      <w:pPr>
-        <w:rPr/>
-      </w:pPr>
-      <w:r>
-        <w:rPr>
-          <w:rtl w:val="0"/>
-        </w:rPr>
         <w:t xml:space="preserve">  table(desarrollo_reconocimientos) {</w:t>
       </w:r>
     </w:p>
@@ -1689,16 +1550,6 @@
         <w:rPr>
           <w:rtl w:val="0"/>
         </w:rPr>
-      </w:r>
-    </w:p>
-    <w:p>
-      <w:pPr>
-        <w:rPr/>
-      </w:pPr>
-      <w:r>
-        <w:rPr>
-          <w:rtl w:val="0"/>
-        </w:rPr>
         <w:t xml:space="preserve">  table(proyecto) {</w:t>
       </w:r>
     </w:p>
@@ -1820,16 +1671,6 @@
         <w:rPr>
           <w:rtl w:val="0"/>
         </w:rPr>
-      </w:r>
-    </w:p>
-    <w:p>
-      <w:pPr>
-        <w:rPr/>
-      </w:pPr>
-      <w:r>
-        <w:rPr>
-          <w:rtl w:val="0"/>
-        </w:rPr>
         <w:t xml:space="preserve">  table(desarrollo) {</w:t>
       </w:r>
     </w:p>
@@ -1918,16 +1759,6 @@
         <w:rPr>
           <w:rtl w:val="0"/>
         </w:rPr>
-      </w:r>
-    </w:p>
-    <w:p>
-      <w:pPr>
-        <w:rPr/>
-      </w:pPr>
-      <w:r>
-        <w:rPr>
-          <w:rtl w:val="0"/>
-        </w:rPr>
         <w:t xml:space="preserve">  table(participante_externo) {</w:t>
       </w:r>
     </w:p>
@@ -1994,16 +1825,6 @@
         <w:rPr>
           <w:rtl w:val="0"/>
         </w:rPr>
-      </w:r>
-    </w:p>
-    <w:p>
-      <w:pPr>
-        <w:rPr/>
-      </w:pPr>
-      <w:r>
-        <w:rPr>
-          <w:rtl w:val="0"/>
-        </w:rPr>
         <w:t xml:space="preserve">  table(proyecto_integrantes) {</w:t>
       </w:r>
     </w:p>
@@ -2070,16 +1891,6 @@
         <w:rPr>
           <w:rtl w:val="0"/>
         </w:rPr>
-      </w:r>
-    </w:p>
-    <w:p>
-      <w:pPr>
-        <w:rPr/>
-      </w:pPr>
-      <w:r>
-        <w:rPr>
-          <w:rtl w:val="0"/>
-        </w:rPr>
         <w:t xml:space="preserve">  table(desarrollo_integrantes) {</w:t>
       </w:r>
     </w:p>
@@ -2157,16 +1968,6 @@
         <w:rPr>
           <w:rtl w:val="0"/>
         </w:rPr>
-      </w:r>
-    </w:p>
-    <w:p>
-      <w:pPr>
-        <w:rPr/>
-      </w:pPr>
-      <w:r>
-        <w:rPr>
-          <w:rtl w:val="0"/>
-        </w:rPr>
         <w:t xml:space="preserve">' ==========================================</w:t>
       </w:r>
     </w:p>
@@ -2200,16 +2001,6 @@
         <w:rPr>
           <w:rtl w:val="0"/>
         </w:rPr>
-      </w:r>
-    </w:p>
-    <w:p>
-      <w:pPr>
-        <w:rPr/>
-      </w:pPr>
-      <w:r>
-        <w:rPr>
-          <w:rtl w:val="0"/>
-        </w:rPr>
         <w:t xml:space="preserve">' --- Núcleo (Arriba) ---</w:t>
       </w:r>
     </w:p>
@@ -2232,16 +2023,6 @@
         <w:rPr>
           <w:rtl w:val="0"/>
         </w:rPr>
-      </w:r>
-    </w:p>
-    <w:p>
-      <w:pPr>
-        <w:rPr/>
-      </w:pPr>
-      <w:r>
-        <w:rPr>
-          <w:rtl w:val="0"/>
-        </w:rPr>
         <w:t xml:space="preserve">' --- Institucional (Arriba a la derecha) ---</w:t>
       </w:r>
     </w:p>
@@ -2286,16 +2067,6 @@
         <w:rPr>
           <w:rtl w:val="0"/>
         </w:rPr>
-      </w:r>
-    </w:p>
-    <w:p>
-      <w:pPr>
-        <w:rPr/>
-      </w:pPr>
-      <w:r>
-        <w:rPr>
-          <w:rtl w:val="0"/>
-        </w:rPr>
         <w:t xml:space="preserve">' --- Gestión (Derecha) ---</w:t>
       </w:r>
     </w:p>
@@ -2340,16 +2111,6 @@
         <w:rPr>
           <w:rtl w:val="0"/>
         </w:rPr>
-      </w:r>
-    </w:p>
-    <w:p>
-      <w:pPr>
-        <w:rPr/>
-      </w:pPr>
-      <w:r>
-        <w:rPr>
-          <w:rtl w:val="0"/>
-        </w:rPr>
         <w:t xml:space="preserve">' --- Producción Académica (Abajo) ---</w:t>
       </w:r>
     </w:p>
@@ -2383,16 +2144,6 @@
         <w:rPr>
           <w:rtl w:val="0"/>
         </w:rPr>
-      </w:r>
-    </w:p>
-    <w:p>
-      <w:pPr>
-        <w:rPr/>
-      </w:pPr>
-      <w:r>
-        <w:rPr>
-          <w:rtl w:val="0"/>
-        </w:rPr>
         <w:t xml:space="preserve">' --- Proyectos y Desarrollos (Izquierda) ---</w:t>
       </w:r>
     </w:p>
@@ -2426,16 +2177,6 @@
         <w:rPr>
           <w:rtl w:val="0"/>
         </w:rPr>
-      </w:r>
-    </w:p>
-    <w:p>
-      <w:pPr>
-        <w:rPr/>
-      </w:pPr>
-      <w:r>
-        <w:rPr>
-          <w:rtl w:val="0"/>
-        </w:rPr>
         <w:t xml:space="preserve">integrante "1" -left---- "0..*" desarrollo_integrantes : "  Desarrolla  "</w:t>
       </w:r>
     </w:p>
@@ -2458,16 +2199,6 @@
         <w:rPr>
           <w:rtl w:val="0"/>
         </w:rPr>
-      </w:r>
-    </w:p>
-    <w:p>
-      <w:pPr>
-        <w:rPr/>
-      </w:pPr>
-      <w:r>
-        <w:rPr>
-          <w:rtl w:val="0"/>
-        </w:rPr>
         <w:t xml:space="preserve">proyecto "1" -up- "0..*" proyecto_reconocimientos : "Obtiene"</w:t>
       </w:r>
     </w:p>
@@ -2490,16 +2221,6 @@
         <w:rPr>
           <w:rtl w:val="0"/>
         </w:rPr>
-      </w:r>
-    </w:p>
-    <w:p>
-      <w:pPr>
-        <w:rPr/>
-      </w:pPr>
-      <w:r>
-        <w:rPr>
-          <w:rtl w:val="0"/>
-        </w:rPr>
         <w:t xml:space="preserve">desarrollo "1" -up- "0..*" desarrollo_reconocimientos : "Obtiene"</w:t>
       </w:r>
     </w:p>
@@ -2522,27 +2243,7 @@
         <w:rPr>
           <w:rtl w:val="0"/>
         </w:rPr>
-      </w:r>
-    </w:p>
-    <w:p>
-      <w:pPr>
-        <w:rPr/>
-      </w:pPr>
-      <w:r>
-        <w:rPr>
-          <w:rtl w:val="0"/>
-        </w:rPr>
         <w:t xml:space="preserve">participante_externo "0..*" -down- "1" desarrollo : "Aporta (Externo)"</w:t>
-      </w:r>
-    </w:p>
-    <w:p>
-      <w:pPr>
-        <w:rPr/>
-      </w:pPr>
-      <w:r>
-        <w:rPr>
-          <w:rtl w:val="0"/>
-        </w:rPr>
       </w:r>
     </w:p>
     <w:p>

</xml_diff>